<commit_message>
Add Taiga login automation with Selenium and Cucumber
</commit_message>
<xml_diff>
--- a/Taiga Project Final Draft.docx
+++ b/Taiga Project Final Draft.docx
@@ -186,7 +186,25 @@
           <w:sz w:val="24"/>
           <w:szCs w:val="24"/>
         </w:rPr>
-        <w:t xml:space="preserve"> Yahya Youseef — </w:t>
+        <w:t xml:space="preserve"> Yahya </w:t>
+      </w:r>
+      <w:proofErr w:type="spellStart"/>
+      <w:r>
+        <w:rPr>
+          <w:rFonts w:ascii="Times New Roman" w:eastAsia="Times New Roman" w:hAnsi="Times New Roman" w:cs="Times New Roman"/>
+          <w:sz w:val="24"/>
+          <w:szCs w:val="24"/>
+        </w:rPr>
+        <w:t>Youseef</w:t>
+      </w:r>
+      <w:proofErr w:type="spellEnd"/>
+      <w:r>
+        <w:rPr>
+          <w:rFonts w:ascii="Times New Roman" w:eastAsia="Times New Roman" w:hAnsi="Times New Roman" w:cs="Times New Roman"/>
+          <w:sz w:val="24"/>
+          <w:szCs w:val="24"/>
+        </w:rPr>
+        <w:t xml:space="preserve"> — </w:t>
       </w:r>
       <w:hyperlink r:id="rId8">
         <w:r>
@@ -310,13 +328,7 @@
         <w:rPr>
           <w:rFonts w:ascii="Arial" w:eastAsia="Arial" w:hAnsi="Arial" w:cs="Arial"/>
         </w:rPr>
-        <w:t xml:space="preserve">1 Introduction ............................................................................................................. </w:t>
-      </w:r>
-      <w:r>
-        <w:rPr>
-          <w:rFonts w:ascii="Arial" w:eastAsia="Arial" w:hAnsi="Arial" w:cs="Arial"/>
-        </w:rPr>
-        <w:t>4</w:t>
+        <w:t>1 Introduction ............................................................................................................. 4</w:t>
       </w:r>
     </w:p>
     <w:p>
@@ -329,13 +341,7 @@
         <w:rPr>
           <w:rFonts w:ascii="Arial" w:eastAsia="Arial" w:hAnsi="Arial" w:cs="Arial"/>
         </w:rPr>
-        <w:t xml:space="preserve">    1.1 Test Project Name ........................................................................................... </w:t>
-      </w:r>
-      <w:r>
-        <w:rPr>
-          <w:rFonts w:ascii="Arial" w:eastAsia="Arial" w:hAnsi="Arial" w:cs="Arial"/>
-        </w:rPr>
-        <w:t>5</w:t>
+        <w:t xml:space="preserve">    1.1 Test Project Name ........................................................................................... 5</w:t>
       </w:r>
     </w:p>
     <w:p>
@@ -348,13 +354,7 @@
         <w:rPr>
           <w:rFonts w:ascii="Arial" w:eastAsia="Arial" w:hAnsi="Arial" w:cs="Arial"/>
         </w:rPr>
-        <w:t xml:space="preserve">    1.2 Revision History .............................................................................................. </w:t>
-      </w:r>
-      <w:r>
-        <w:rPr>
-          <w:rFonts w:ascii="Arial" w:eastAsia="Arial" w:hAnsi="Arial" w:cs="Arial"/>
-        </w:rPr>
-        <w:t>5</w:t>
+        <w:t xml:space="preserve">    1.2 Revision History .............................................................................................. 5</w:t>
       </w:r>
     </w:p>
     <w:p>
@@ -367,13 +367,7 @@
         <w:rPr>
           <w:rFonts w:ascii="Arial" w:eastAsia="Arial" w:hAnsi="Arial" w:cs="Arial"/>
         </w:rPr>
-        <w:t xml:space="preserve">    1.3 Terminology and Definitions ........................................................................... </w:t>
-      </w:r>
-      <w:r>
-        <w:rPr>
-          <w:rFonts w:ascii="Arial" w:eastAsia="Arial" w:hAnsi="Arial" w:cs="Arial"/>
-        </w:rPr>
-        <w:t>5</w:t>
+        <w:t xml:space="preserve">    1.3 Terminology and Definitions ........................................................................... 5</w:t>
       </w:r>
     </w:p>
     <w:p>
@@ -386,13 +380,7 @@
         <w:rPr>
           <w:rFonts w:ascii="Arial" w:eastAsia="Arial" w:hAnsi="Arial" w:cs="Arial"/>
         </w:rPr>
-        <w:t xml:space="preserve">    1.4 Name of Approvers and Date of Approval ....................................................... </w:t>
-      </w:r>
-      <w:r>
-        <w:rPr>
-          <w:rFonts w:ascii="Arial" w:eastAsia="Arial" w:hAnsi="Arial" w:cs="Arial"/>
-        </w:rPr>
-        <w:t>6</w:t>
+        <w:t xml:space="preserve">    1.4 Name of Approvers and Date of Approval ....................................................... 6</w:t>
       </w:r>
     </w:p>
     <w:p>
@@ -405,13 +393,7 @@
         <w:rPr>
           <w:rFonts w:ascii="Arial" w:eastAsia="Arial" w:hAnsi="Arial" w:cs="Arial"/>
         </w:rPr>
-        <w:t xml:space="preserve">    1.5 References ....................................................................................................... </w:t>
-      </w:r>
-      <w:r>
-        <w:rPr>
-          <w:rFonts w:ascii="Arial" w:eastAsia="Arial" w:hAnsi="Arial" w:cs="Arial"/>
-        </w:rPr>
-        <w:t>6</w:t>
+        <w:t xml:space="preserve">    1.5 References ....................................................................................................... 6</w:t>
       </w:r>
     </w:p>
     <w:p>
@@ -424,13 +406,7 @@
         <w:rPr>
           <w:rFonts w:ascii="Arial" w:eastAsia="Arial" w:hAnsi="Arial" w:cs="Arial"/>
         </w:rPr>
-        <w:t xml:space="preserve">    1.6 Summary of the Rest of the Test Plan ............................................................ </w:t>
-      </w:r>
-      <w:r>
-        <w:rPr>
-          <w:rFonts w:ascii="Arial" w:eastAsia="Arial" w:hAnsi="Arial" w:cs="Arial"/>
-        </w:rPr>
-        <w:t>6</w:t>
+        <w:t xml:space="preserve">    1.6 Summary of the Rest of the Test Plan ............................................................ 6</w:t>
       </w:r>
     </w:p>
     <w:p>
@@ -443,13 +419,7 @@
         <w:rPr>
           <w:rFonts w:ascii="Arial" w:eastAsia="Arial" w:hAnsi="Arial" w:cs="Arial"/>
         </w:rPr>
-        <w:t xml:space="preserve">2 Feature Description ................................................................................................. </w:t>
-      </w:r>
-      <w:r>
-        <w:rPr>
-          <w:rFonts w:ascii="Arial" w:eastAsia="Arial" w:hAnsi="Arial" w:cs="Arial"/>
-        </w:rPr>
-        <w:t>7</w:t>
+        <w:t>2 Feature Description ................................................................................................. 7</w:t>
       </w:r>
     </w:p>
     <w:p>
@@ -589,13 +559,7 @@
         <w:rPr>
           <w:rFonts w:ascii="Arial" w:eastAsia="Arial" w:hAnsi="Arial" w:cs="Arial"/>
         </w:rPr>
-        <w:t>....................................................................</w:t>
-      </w:r>
-      <w:r>
-        <w:rPr>
-          <w:rFonts w:ascii="Arial" w:eastAsia="Arial" w:hAnsi="Arial" w:cs="Arial"/>
-        </w:rPr>
-        <w:t>11</w:t>
+        <w:t>....................................................................11</w:t>
       </w:r>
     </w:p>
     <w:p>
@@ -2796,25 +2760,7 @@
                 <w:sz w:val="20"/>
                 <w:szCs w:val="20"/>
               </w:rPr>
-              <w:t xml:space="preserve">A unit of work derived from a </w:t>
-            </w:r>
-            <w:r>
-              <w:rPr>
-                <w:rFonts w:ascii="Arial" w:eastAsia="Arial" w:hAnsi="Arial" w:cs="Arial"/>
-                <w:color w:val="000000" w:themeColor="text1"/>
-                <w:sz w:val="20"/>
-                <w:szCs w:val="20"/>
-              </w:rPr>
-              <w:t>user's</w:t>
-            </w:r>
-            <w:r>
-              <w:rPr>
-                <w:rFonts w:ascii="Arial" w:eastAsia="Arial" w:hAnsi="Arial" w:cs="Arial"/>
-                <w:color w:val="000000" w:themeColor="text1"/>
-                <w:sz w:val="20"/>
-                <w:szCs w:val="20"/>
-              </w:rPr>
-              <w:t xml:space="preserve"> story or project requirement.</w:t>
+              <w:t>A unit of work derived from a user's story or project requirement.</w:t>
             </w:r>
           </w:p>
         </w:tc>
@@ -2972,25 +2918,7 @@
                 <w:sz w:val="20"/>
                 <w:szCs w:val="20"/>
               </w:rPr>
-              <w:t xml:space="preserve">A testing technique that identifies characteristics and </w:t>
-            </w:r>
-            <w:r>
-              <w:rPr>
-                <w:rFonts w:ascii="Arial" w:eastAsia="Arial" w:hAnsi="Arial" w:cs="Arial"/>
-                <w:color w:val="000000" w:themeColor="text1"/>
-                <w:sz w:val="20"/>
-                <w:szCs w:val="20"/>
-              </w:rPr>
-              <w:t>partitions of</w:t>
-            </w:r>
-            <w:r>
-              <w:rPr>
-                <w:rFonts w:ascii="Arial" w:eastAsia="Arial" w:hAnsi="Arial" w:cs="Arial"/>
-                <w:color w:val="000000" w:themeColor="text1"/>
-                <w:sz w:val="20"/>
-                <w:szCs w:val="20"/>
-              </w:rPr>
-              <w:t xml:space="preserve"> input spaces into equivalence classes.</w:t>
+              <w:t>A testing technique that identifies characteristics and partitions of input spaces into equivalence classes.</w:t>
             </w:r>
           </w:p>
         </w:tc>
@@ -3954,17 +3882,7 @@
             <w:sz w:val="24"/>
             <w:szCs w:val="24"/>
           </w:rPr>
-          <w:t>https://github.com/taigaio/taiga</w:t>
-        </w:r>
-        <w:r>
-          <w:rPr>
-            <w:rStyle w:val="Hyperlink"/>
-            <w:rFonts w:ascii="Arial" w:eastAsia="Arial" w:hAnsi="Arial" w:cs="Arial"/>
-            <w:color w:val="C00000"/>
-            <w:sz w:val="24"/>
-            <w:szCs w:val="24"/>
-          </w:rPr>
-          <w:t>,</w:t>
+          <w:t>https://github.com/taigaio/taiga,</w:t>
         </w:r>
       </w:hyperlink>
       <w:r>
@@ -3974,16 +3892,7 @@
           <w:sz w:val="24"/>
           <w:szCs w:val="24"/>
         </w:rPr>
-        <w:t xml:space="preserve"> </w:t>
-      </w:r>
-      <w:r>
-        <w:rPr>
-          <w:rFonts w:ascii="Arial" w:eastAsia="Arial" w:hAnsi="Arial" w:cs="Arial"/>
-          <w:color w:val="C00000"/>
-          <w:sz w:val="24"/>
-          <w:szCs w:val="24"/>
-        </w:rPr>
-        <w:t>Taiga Documentation</w:t>
+        <w:t xml:space="preserve"> Taiga Documentation</w:t>
       </w:r>
       <w:r>
         <w:br/>
@@ -4057,7 +3966,27 @@
           <w:sz w:val="24"/>
           <w:szCs w:val="24"/>
         </w:rPr>
-        <w:t>Ammann, P., &amp; Offutt, J. (2016). Introduction to software testing. 2nd edition. Cambridge University Press.ISBN: 9781107172012 Ammann, P., &amp; Offutt, J. (2016</w:t>
+        <w:t xml:space="preserve">Ammann, P., &amp; Offutt, J. (2016). Introduction to software testing. 2nd edition. Cambridge University </w:t>
+      </w:r>
+      <w:proofErr w:type="spellStart"/>
+      <w:r>
+        <w:rPr>
+          <w:rFonts w:ascii="Arial" w:eastAsia="Arial" w:hAnsi="Arial" w:cs="Arial"/>
+          <w:color w:val="C00000"/>
+          <w:sz w:val="24"/>
+          <w:szCs w:val="24"/>
+        </w:rPr>
+        <w:t>Press.ISBN</w:t>
+      </w:r>
+      <w:proofErr w:type="spellEnd"/>
+      <w:r>
+        <w:rPr>
+          <w:rFonts w:ascii="Arial" w:eastAsia="Arial" w:hAnsi="Arial" w:cs="Arial"/>
+          <w:color w:val="C00000"/>
+          <w:sz w:val="24"/>
+          <w:szCs w:val="24"/>
+        </w:rPr>
+        <w:t>: 9781107172012 Ammann, P., &amp; Offutt, J. (2016</w:t>
       </w:r>
     </w:p>
     <w:p>
@@ -6489,7 +6418,7 @@
           <w:noProof/>
         </w:rPr>
         <w:drawing>
-          <wp:inline distT="0" distB="0" distL="0" distR="0" wp14:anchorId="172EEA76" wp14:editId="79866251">
+          <wp:inline distT="0" distB="0" distL="0" distR="0" wp14:anchorId="0DEF6815" wp14:editId="3478A90C">
             <wp:extent cx="5953125" cy="1752600"/>
             <wp:effectExtent l="0" t="0" r="0" b="0"/>
             <wp:docPr id="909752101" name="drawing"/>
@@ -15814,7 +15743,7 @@
           <w:noProof/>
         </w:rPr>
         <w:drawing>
-          <wp:inline distT="0" distB="0" distL="0" distR="0" wp14:anchorId="42E3DD9C" wp14:editId="71C76D6F">
+          <wp:inline distT="0" distB="0" distL="0" distR="0" wp14:anchorId="13FA0CC6" wp14:editId="7AC8D27B">
             <wp:extent cx="5943600" cy="3333750"/>
             <wp:effectExtent l="0" t="0" r="0" b="0"/>
             <wp:docPr id="1288889191" name="drawing"/>
@@ -15876,6 +15805,7 @@
           <w:sz w:val="24"/>
           <w:szCs w:val="24"/>
         </w:rPr>
+        <w:lastRenderedPageBreak/>
         <w:t>B.2 Task Test Cases Execution Results:</w:t>
       </w:r>
     </w:p>
@@ -15926,7 +15856,6 @@
                 <w:sz w:val="16"/>
                 <w:szCs w:val="16"/>
               </w:rPr>
-              <w:lastRenderedPageBreak/>
               <w:t>Test ID</w:t>
             </w:r>
           </w:p>
@@ -16839,7 +16768,7 @@
           <w:noProof/>
         </w:rPr>
         <w:drawing>
-          <wp:inline distT="0" distB="0" distL="0" distR="0" wp14:anchorId="2DD42844" wp14:editId="03E5F4C4">
+          <wp:inline distT="0" distB="0" distL="0" distR="0" wp14:anchorId="053FAEA0" wp14:editId="771AE000">
             <wp:extent cx="5943600" cy="2238375"/>
             <wp:effectExtent l="0" t="0" r="0" b="0"/>
             <wp:docPr id="1857194154" name="drawing"/>
@@ -17515,6 +17444,7 @@
                 <w:sz w:val="16"/>
                 <w:szCs w:val="16"/>
               </w:rPr>
+              <w:lastRenderedPageBreak/>
               <w:t>IS-03</w:t>
             </w:r>
           </w:p>
@@ -17699,7 +17629,6 @@
                 <w:sz w:val="16"/>
                 <w:szCs w:val="16"/>
               </w:rPr>
-              <w:lastRenderedPageBreak/>
               <w:t>IS-04</w:t>
             </w:r>
           </w:p>
@@ -17875,7 +17804,7 @@
           <w:noProof/>
         </w:rPr>
         <w:drawing>
-          <wp:inline distT="0" distB="0" distL="0" distR="0" wp14:anchorId="3BCB22C5" wp14:editId="78DB1CC0">
+          <wp:inline distT="0" distB="0" distL="0" distR="0" wp14:anchorId="5D1062D3" wp14:editId="58AC182F">
             <wp:extent cx="5943600" cy="2028825"/>
             <wp:effectExtent l="0" t="0" r="0" b="0"/>
             <wp:docPr id="1328286350" name="drawing"/>
@@ -18900,7 +18829,7 @@
         </w:rPr>
         <w:lastRenderedPageBreak/>
         <w:drawing>
-          <wp:inline distT="0" distB="0" distL="0" distR="0" wp14:anchorId="5C0C9CB4" wp14:editId="6D5A49E7">
+          <wp:inline distT="0" distB="0" distL="0" distR="0" wp14:anchorId="5D28B39D" wp14:editId="7D7F877E">
             <wp:extent cx="5943600" cy="2219325"/>
             <wp:effectExtent l="0" t="0" r="0" b="0"/>
             <wp:docPr id="1812214052" name="drawing"/>
@@ -20131,7 +20060,7 @@
         </w:rPr>
         <w:lastRenderedPageBreak/>
         <w:drawing>
-          <wp:inline distT="0" distB="0" distL="0" distR="0" wp14:anchorId="50221766" wp14:editId="60ABBBCE">
+          <wp:inline distT="0" distB="0" distL="0" distR="0" wp14:anchorId="207DD779" wp14:editId="16C0099D">
             <wp:extent cx="5943600" cy="2867025"/>
             <wp:effectExtent l="0" t="0" r="0" b="0"/>
             <wp:docPr id="847892100" name="drawing"/>
@@ -24821,7 +24750,7 @@
         </w:rPr>
         <w:lastRenderedPageBreak/>
         <w:drawing>
-          <wp:inline distT="0" distB="0" distL="0" distR="0" wp14:anchorId="6B55C504" wp14:editId="0997037D">
+          <wp:inline distT="0" distB="0" distL="0" distR="0" wp14:anchorId="603D788A" wp14:editId="3146424A">
             <wp:extent cx="5943600" cy="3133725"/>
             <wp:effectExtent l="0" t="0" r="0" b="0"/>
             <wp:docPr id="83809543" name="drawing"/>
@@ -24890,6 +24819,7 @@
         </w:rPr>
       </w:pPr>
     </w:p>
+    <w:p/>
     <w:sectPr>
       <w:pgSz w:w="12240" w:h="15840"/>
       <w:pgMar w:top="1440" w:right="1800" w:bottom="1440" w:left="1800" w:header="720" w:footer="720" w:gutter="0"/>

</xml_diff>